<commit_message>
move old files to older. add gender bias paragraph
</commit_message>
<xml_diff>
--- a/ms-2026-04-16.docx
+++ b/ms-2026-04-16.docx
@@ -1027,6 +1027,7 @@
         <w:t>.</w:t>
       </w:r>
       <w:commentRangeStart w:id="15"/>
+      <w:commentRangeStart w:id="16"/>
       <w:r>
         <w:t xml:space="preserve"> The extracted signatures were broadly consistent between the two methods </w:t>
       </w:r>
@@ -1048,13 +1049,6 @@
         </w:rPr>
         <w:commentReference w:id="15"/>
       </w:r>
-      <w:r>
-        <w:t>e identified 44 mutational signatures in the new 89-type classification and, independently, the 44 corresponding signatures in the new 476-type classification. We assessed concordance between signatures identified in two classification systems by collapsing the 476-type signatures to their 89-type counterparts and comparing them to signatures extracted in the 89-type classification. Mean cosine similarity was &gt; 0.989 (median &gt; 0.994, minimum &gt; 0.951), providing evidence that these signatures constitute latent factors robust to the feature set in whic</w:t>
-      </w:r>
-      <w:commentRangeStart w:id="16"/>
-      <w:r>
-        <w:t xml:space="preserve">h the </w:t>
-      </w:r>
       <w:commentRangeEnd w:id="16"/>
       <w:r>
         <w:rPr>
@@ -1065,6 +1059,22 @@
         <w:commentReference w:id="16"/>
       </w:r>
       <w:r>
+        <w:t>e identified 44 mutational signatures in the new 89-type classification and, independently, the 44 corresponding signatures in the new 476-type classification. We assessed concordance between signatures identified in two classification systems by collapsing the 476-type signatures to their 89-type counterparts and comparing them to signatures extracted in the 89-type classification. Mean cosine similarity was &gt; 0.989 (median &gt; 0.994, minimum &gt; 0.951), providing evidence that these signatures constitute latent factors robust to the feature set in whic</w:t>
+      </w:r>
+      <w:commentRangeStart w:id="17"/>
+      <w:r>
+        <w:t xml:space="preserve">h the </w:t>
+      </w:r>
+      <w:commentRangeEnd w:id="17"/>
+      <w:r>
+        <w:rPr>
+          <w:rStyle w:val="CommentReference"/>
+          <w:sz w:val="24"/>
+          <w:szCs w:val="24"/>
+        </w:rPr>
+        <w:commentReference w:id="17"/>
+      </w:r>
+      <w:r>
         <w:t xml:space="preserve">were discovered. Further evidence of their robustness derives from the identification of tumor spectra dominated by a single signature. For </w:t>
       </w:r>
       <w:r>
@@ -1089,11 +1099,11 @@
         <w:lastRenderedPageBreak/>
         <w:t xml:space="preserve">identified in the 89-type classification, similar signatures were previously described for 18 </w:t>
       </w:r>
-      <w:bookmarkStart w:id="17" w:name="ZOTERO_BREF_DLtC4TQmbVUR"/>
+      <w:bookmarkStart w:id="18" w:name="ZOTERO_BREF_DLtC4TQmbVUR"/>
       <w:r>
         <w:t>(Koh et al. 2025)</w:t>
       </w:r>
-      <w:bookmarkEnd w:id="17"/>
+      <w:bookmarkEnd w:id="18"/>
       <w:r>
         <w:t xml:space="preserve">. </w:t>
       </w:r>
@@ -1106,11 +1116,11 @@
       <w:r>
         <w:t xml:space="preserve">We also carried out signature discovery in spectra in the 83-type classification, and discovered 34 signatures, of which 20 were similar to signatures in the COSMIC reference set and 3 additional signatures were similar to signatures identified in </w:t>
       </w:r>
-      <w:bookmarkStart w:id="18" w:name="ZOTERO_BREF_RenPiKIXIJyQ"/>
+      <w:bookmarkStart w:id="19" w:name="ZOTERO_BREF_RenPiKIXIJyQ"/>
       <w:r>
         <w:t>(Jin et al. 2024b)</w:t>
       </w:r>
-      <w:bookmarkEnd w:id="18"/>
+      <w:bookmarkEnd w:id="19"/>
       <w:r>
         <w:t>.</w:t>
       </w:r>
@@ -1165,14 +1175,14 @@
       <w:r>
         <w:t xml:space="preserve">Conversely, there were two cases in which the 83-type and 476 type systems were able to distinguish two signatures that were similar the 89-type system. In the 89-type system InsDel13 and InsDel_C look very similar because the 89-type system combines deletion of single Ts in stretches of 1, 2, 3, or 4 Ts. However the 83 and 476 type systems show that InsDelC has deletions of 1 T from ATA (ATA → AA), while InsDel13 as deletions of T from ATTA (ATTA → ATA). </w:t>
       </w:r>
-      <w:commentRangeStart w:id="19"/>
+      <w:commentRangeStart w:id="20"/>
       <w:r>
         <w:rPr>
           <w:shd w:val="clear" w:color="auto" w:fill="FFFF00"/>
         </w:rPr>
         <w:t>&lt;time permitting – do sup fig&gt;</w:t>
       </w:r>
-      <w:commentRangeEnd w:id="19"/>
+      <w:commentRangeEnd w:id="20"/>
       <w:r>
         <w:rPr>
           <w:rStyle w:val="CommentReference"/>
@@ -1180,7 +1190,7 @@
           <w:szCs w:val="24"/>
           <w:shd w:val="clear" w:color="auto" w:fill="FFFF00"/>
         </w:rPr>
-        <w:commentReference w:id="19"/>
+        <w:commentReference w:id="20"/>
       </w:r>
       <w:r>
         <w:rPr>
@@ -1526,14 +1536,14 @@
         </w:rPr>
         <w:t>&lt;</w:t>
       </w:r>
-      <w:commentRangeStart w:id="20"/>
+      <w:commentRangeStart w:id="21"/>
       <w:r>
         <w:rPr>
           <w:shd w:val="clear" w:color="auto" w:fill="FFFF00"/>
         </w:rPr>
         <w:t>Maybe say B is clock-like</w:t>
       </w:r>
-      <w:commentRangeEnd w:id="20"/>
+      <w:commentRangeEnd w:id="21"/>
       <w:r>
         <w:rPr>
           <w:rStyle w:val="CommentReference"/>
@@ -1541,7 +1551,7 @@
           <w:szCs w:val="24"/>
           <w:shd w:val="clear" w:color="auto" w:fill="FFFF00"/>
         </w:rPr>
-        <w:commentReference w:id="20"/>
+        <w:commentReference w:id="21"/>
       </w:r>
       <w:r>
         <w:rPr>
@@ -1551,7 +1561,7 @@
       </w:r>
     </w:p>
     <w:p>
-      <w:commentRangeStart w:id="21"/>
+      <w:commentRangeStart w:id="22"/>
       <w:r>
         <w:rPr>
           <w:shd w:val="clear" w:color="auto" w:fill="FFFF00"/>
@@ -1561,14 +1571,14 @@
       <w:r>
         <w:t xml:space="preserve">9-type signature assignments revealed strong concordance with the 83-type signatures when a one-to-one mapping was present. </w:t>
       </w:r>
-      <w:commentRangeEnd w:id="21"/>
+      <w:commentRangeEnd w:id="22"/>
       <w:r>
         <w:rPr>
           <w:rStyle w:val="CommentReference"/>
           <w:sz w:val="24"/>
           <w:szCs w:val="24"/>
         </w:rPr>
-        <w:commentReference w:id="21"/>
+        <w:commentReference w:id="22"/>
       </w:r>
       <w:r>
         <w:t xml:space="preserve">When an 83-type signature was represented by multiple 89-type signatures (e.g., C_ID1 was captured by InsDel1a, InsDel1b, InsDel1c, and InsDel1d), </w:t>
@@ -1861,7 +1871,7 @@
       <w:r>
         <w:t>). Signatures attributed to exogenous mutational processes, such as C_ID3 (tobacco smoking exposure),</w:t>
       </w:r>
-      <w:commentRangeStart w:id="22"/>
+      <w:commentRangeStart w:id="23"/>
       <w:r>
         <w:t xml:space="preserve"> C_ID14 (</w:t>
       </w:r>
@@ -1874,14 +1884,14 @@
       <w:r>
         <w:t>)</w:t>
       </w:r>
-      <w:commentRangeEnd w:id="22"/>
+      <w:commentRangeEnd w:id="23"/>
       <w:r>
         <w:rPr>
           <w:rStyle w:val="CommentReference"/>
           <w:sz w:val="24"/>
           <w:szCs w:val="24"/>
         </w:rPr>
-        <w:commentReference w:id="22"/>
+        <w:commentReference w:id="23"/>
       </w:r>
       <w:r>
         <w:t xml:space="preserve"> and C_ID18 colibactin exposure), showed consistent transcription strand bias </w:t>
@@ -2133,7 +2143,7 @@
       <w:r>
         <w:t xml:space="preserve">Cells with RNase H2 deficiency cannot efficiently remove ribonucleotides that had been incorporated into genomic DNA, which sets the stage for topoisomerase-1 (TOP1) associated mutagenesis. This was previously thought to generate indel signature ID4 </w:t>
       </w:r>
-      <w:bookmarkStart w:id="23" w:name="ZOTERO_BREF_xeDB1zkV4c3y"/>
+      <w:bookmarkStart w:id="24" w:name="ZOTERO_BREF_xeDB1zkV4c3y"/>
       <w:r>
         <w:t xml:space="preserve">(Jin et al. 2024a; </w:t>
       </w:r>
@@ -2141,7 +2151,7 @@
         <w:lastRenderedPageBreak/>
         <w:t>Reijns et al. 2022; Koh et al. 2025)</w:t>
       </w:r>
-      <w:bookmarkEnd w:id="23"/>
+      <w:bookmarkEnd w:id="24"/>
       <w:r>
         <w:t xml:space="preserve">. However, we detected a new indel signature, InsDel_F, which better corresponds to RNase H2 deficiency experimental data than ID4 </w:t>
       </w:r>
@@ -2188,27 +2198,253 @@
     <w:p>
       <w:pPr>
         <w:pStyle w:val="Heading2"/>
-      </w:pPr>
-      <w:commentRangeStart w:id="24"/>
-      <w:r>
-        <w:lastRenderedPageBreak/>
+        <w:rPr>
+          <w:rFonts w:eastAsia="宋体"/>
+        </w:rPr>
+      </w:pPr>
+      <w:commentRangeStart w:id="25"/>
+      <w:r>
         <w:t>Functional and Demographic Associations  &lt;was here, removed to separate doc functional_and_demographic.docx&gt; Are we keeping sex differences?</w:t>
       </w:r>
-      <w:commentRangeEnd w:id="24"/>
+      <w:commentRangeEnd w:id="25"/>
       <w:r>
         <w:rPr>
           <w:rStyle w:val="CommentReference"/>
+          <w:rFonts w:eastAsia="宋体"/>
           <w:sz w:val="24"/>
           <w:szCs w:val="24"/>
         </w:rPr>
-        <w:commentReference w:id="24"/>
-      </w:r>
+        <w:commentReference w:id="25"/>
+      </w:r>
+    </w:p>
+    <w:p>
+      <w:pPr>
+        <w:rPr>
+          <w:rFonts w:eastAsia="宋体"/>
+        </w:rPr>
+      </w:pPr>
+    </w:p>
+    <w:p>
+      <w:pPr>
+        <w:rPr>
+          <w:rFonts w:eastAsia="宋体"/>
+        </w:rPr>
+      </w:pPr>
+    </w:p>
+    <w:p>
+      <w:pPr>
+        <w:rPr>
+          <w:rFonts w:eastAsia="宋体"/>
+        </w:rPr>
+      </w:pPr>
+      <w:commentRangeStart w:id="26"/>
+      <w:r>
+        <w:rPr>
+          <w:rFonts w:eastAsia="宋体"/>
+        </w:rPr>
+        <w:lastRenderedPageBreak/>
+        <w:t xml:space="preserve">To investigate the </w:t>
+      </w:r>
+      <w:r>
+        <w:rPr>
+          <w:rFonts w:eastAsia="宋体" w:hint="eastAsia"/>
+        </w:rPr>
+        <w:t>gender bias</w:t>
+      </w:r>
+      <w:r>
+        <w:rPr>
+          <w:rFonts w:eastAsia="宋体"/>
+        </w:rPr>
+        <w:t xml:space="preserve"> of mutational processes, we systematically compared signature activities between sexes using two-sided Fisher’s exact tests. After Benjamini–Hochberg correction (q &lt; 0.2), we identified nine gender-biased associations that reveal a distinct polarity between tumor types. Male-skewed processes were predominant in lung, liver, and "Other" tumor categories. Specifically, lung cancer exhibited significant male enrichment in InsDel3b (OR = 0.367, q = 0.061) and C_ID3 (OR = 0.397, q = 0.188)</w:t>
+      </w:r>
+      <w:r>
+        <w:rPr>
+          <w:rFonts w:eastAsia="宋体" w:hint="eastAsia"/>
+        </w:rPr>
+        <w:t xml:space="preserve">. </w:t>
+      </w:r>
+      <w:r>
+        <w:rPr>
+          <w:rFonts w:eastAsia="宋体"/>
+        </w:rPr>
+        <w:t>Given the established association of these signatures with tobacco consumption, this enrichment likely reflects higher smoking-related mutagenic burdens in the male coho</w:t>
+      </w:r>
+      <w:r>
+        <w:rPr>
+          <w:rFonts w:eastAsia="宋体" w:hint="eastAsia"/>
+        </w:rPr>
+        <w:t>rt. In</w:t>
+      </w:r>
+      <w:r>
+        <w:rPr>
+          <w:rFonts w:eastAsia="宋体"/>
+        </w:rPr>
+        <w:t xml:space="preserve"> liver cancer</w:t>
+      </w:r>
+      <w:r>
+        <w:rPr>
+          <w:rFonts w:eastAsia="宋体" w:hint="eastAsia"/>
+        </w:rPr>
+        <w:t>,</w:t>
+      </w:r>
+      <w:r>
+        <w:rPr>
+          <w:rFonts w:eastAsia="宋体"/>
+        </w:rPr>
+        <w:t xml:space="preserve"> a similar trend </w:t>
+      </w:r>
+      <w:r>
+        <w:rPr>
+          <w:rFonts w:eastAsia="宋体" w:hint="eastAsia"/>
+        </w:rPr>
+        <w:t xml:space="preserve">was observed </w:t>
+      </w:r>
+      <w:r>
+        <w:rPr>
+          <w:rFonts w:eastAsia="宋体"/>
+        </w:rPr>
+        <w:t xml:space="preserve">for InsDel5a </w:t>
+      </w:r>
+      <w:r>
+        <w:rPr>
+          <w:rFonts w:eastAsia="宋体" w:hint="eastAsia"/>
+        </w:rPr>
+        <w:t>(</w:t>
+      </w:r>
+      <w:r>
+        <w:rPr>
+          <w:rFonts w:eastAsia="宋体"/>
+        </w:rPr>
+        <w:t>OR = 0.481, q = 0.118</w:t>
+      </w:r>
+      <w:r>
+        <w:rPr>
+          <w:rFonts w:eastAsia="宋体" w:hint="eastAsia"/>
+        </w:rPr>
+        <w:t>, clock-like</w:t>
+      </w:r>
+      <w:r>
+        <w:rPr>
+          <w:rFonts w:eastAsia="宋体"/>
+        </w:rPr>
+        <w:t>)</w:t>
+      </w:r>
+      <w:r>
+        <w:rPr>
+          <w:rFonts w:eastAsia="宋体" w:hint="eastAsia"/>
+        </w:rPr>
+        <w:t xml:space="preserve"> and </w:t>
+      </w:r>
+      <w:r>
+        <w:rPr>
+          <w:rFonts w:eastAsia="宋体"/>
+        </w:rPr>
+        <w:t>InsDel8</w:t>
+      </w:r>
+      <w:r>
+        <w:rPr>
+          <w:rFonts w:eastAsia="宋体" w:hint="eastAsia"/>
+        </w:rPr>
+        <w:t>/C_ID8</w:t>
+      </w:r>
+      <w:r>
+        <w:rPr>
+          <w:rFonts w:eastAsia="宋体"/>
+        </w:rPr>
+        <w:t xml:space="preserve"> (R = 0.271, q = 0.184</w:t>
+      </w:r>
+      <w:r>
+        <w:rPr>
+          <w:rFonts w:eastAsia="宋体" w:hint="eastAsia"/>
+        </w:rPr>
+        <w:t xml:space="preserve">, DSB repair by NHEJ and age associated </w:t>
+      </w:r>
+      <w:r>
+        <w:rPr>
+          <w:rFonts w:eastAsia="宋体"/>
+        </w:rPr>
+        <w:t>). This male-biased pattern extended to the "Other" category via C_ID19 (OR = 0.424, q = 0.188</w:t>
+      </w:r>
+      <w:r>
+        <w:rPr>
+          <w:rFonts w:eastAsia="宋体" w:hint="eastAsia"/>
+        </w:rPr>
+        <w:t>)</w:t>
+      </w:r>
+      <w:r>
+        <w:rPr>
+          <w:rFonts w:eastAsia="宋体"/>
+        </w:rPr>
+        <w:t xml:space="preserve"> and InsDel19b (OR = 0.448, q = 0.197). Conversely, female-biased signatures were </w:t>
+      </w:r>
+      <w:r>
+        <w:rPr>
+          <w:rFonts w:eastAsia="宋体"/>
+        </w:rPr>
+        <w:t>occurred</w:t>
+      </w:r>
+      <w:r>
+        <w:rPr>
+          <w:rFonts w:eastAsia="宋体"/>
+        </w:rPr>
+        <w:t xml:space="preserve"> </w:t>
+      </w:r>
+      <w:r>
+        <w:rPr>
+          <w:rFonts w:eastAsia="宋体" w:hint="eastAsia"/>
+        </w:rPr>
+        <w:t>in</w:t>
+      </w:r>
+      <w:r>
+        <w:rPr>
+          <w:rFonts w:eastAsia="宋体"/>
+        </w:rPr>
+        <w:t xml:space="preserve"> esophageal and lymphoid malignancies. The magnitude of these associations was most pronounced in esophageal cancer for InsDel1a (OR = 3.85, q = 0.061) and C_ID1 (OR = 3.22, q = 0.188), alongside InsDel1c (OR = 2.63, q = 0.194) in lymphoid cancers. These results delineate a sex-stratified landscape of mutational etiology, suggesting that the underlying biological mechanisms driving genome instability are fundamentally influenced by gender.</w:t>
+      </w:r>
+      <w:commentRangeEnd w:id="26"/>
+      <w:r>
+        <w:rPr>
+          <w:rStyle w:val="CommentReference"/>
+          <w:rFonts w:eastAsia="宋体"/>
+          <w:sz w:val="24"/>
+          <w:szCs w:val="24"/>
+        </w:rPr>
+        <w:commentReference w:id="26"/>
+      </w:r>
+    </w:p>
+    <w:p>
+      <w:pPr>
+        <w:rPr>
+          <w:rFonts w:eastAsia="宋体"/>
+        </w:rPr>
+      </w:pPr>
+      <w:r>
+        <w:rPr>
+          <w:rFonts w:eastAsia="宋体"/>
+        </w:rPr>
+        <w:t>.</w:t>
+      </w:r>
+    </w:p>
+    <w:p>
+      <w:pPr>
+        <w:rPr>
+          <w:rFonts w:eastAsia="宋体"/>
+        </w:rPr>
+      </w:pPr>
+    </w:p>
+    <w:p>
+      <w:pPr>
+        <w:rPr>
+          <w:rFonts w:eastAsia="宋体" w:hint="eastAsia"/>
+        </w:rPr>
+      </w:pPr>
     </w:p>
     <w:p>
       <w:pPr>
         <w:pStyle w:val="Heading1"/>
       </w:pPr>
       <w:r>
+        <w:lastRenderedPageBreak/>
         <w:t>Discussion</w:t>
       </w:r>
     </w:p>
@@ -2237,21 +2473,18 @@
         <w:t xml:space="preserve">The study reported a 37 InDel signature database sourced from 4,775 genomes across 7 cancer types. </w:t>
       </w:r>
       <w:r>
-        <w:t xml:space="preserve">However, challenges remain in connecting the nomenclature of 89-type signatures to the established 83-type signatures. For instance, COSMIC ID5 is recognized as a clock-like signature, whereas Koh et al.'s InD5 likely reflects a sequencing artifact. By analyzing a larger and more diverse cancer genome cohort, we not only expanded the existing signature database but also systematically linked and unified the naming conventions of the 83-type and 89-type </w:t>
-      </w:r>
+        <w:t>However, challenges remain in connecting the nomenclature of 89-type signatures to the established 83-type signatures. For instance, COSMIC ID5 is recognized as a clock-like signature, whereas Koh et al.'s InD5 likely reflects a sequencing artifact. By analyzing a larger and more diverse cancer genome cohort, we not only expanded the existing signature database but also systematically linked and unified the naming conventions of the 83-type and 89-type signatures. This unified framework will support more consistent interpretation and application of indel mutational signatures</w:t>
+      </w:r>
+      <w:r>
+        <w:rPr>
+          <w:rFonts w:hint="eastAsia"/>
+        </w:rPr>
+        <w:t xml:space="preserve"> (Vignette).</w:t>
+      </w:r>
+    </w:p>
+    <w:p>
       <w:r>
         <w:lastRenderedPageBreak/>
-        <w:t>signatures. This unified framework will support more consistent interpretation and application of indel mutational signatures</w:t>
-      </w:r>
-      <w:r>
-        <w:rPr>
-          <w:rFonts w:hint="eastAsia"/>
-        </w:rPr>
-        <w:t xml:space="preserve"> (Vignette).</w:t>
-      </w:r>
-    </w:p>
-    <w:p>
-      <w:r>
         <w:t>The identification of novel mutational signatures often poses challenges in linking them to specific mutational processes, a complexity exacerbated by the diverse mutational landscapes observed across pan-cancer datasets. By integrating additional data into mutational signature analysis, we anticipate uncovering further signatures that more comprehensively characterize genomic mutational processes.</w:t>
       </w:r>
       <w:r>
@@ -2398,7 +2631,6 @@
         <w:rPr>
           <w:rFonts w:hint="eastAsia"/>
         </w:rPr>
-        <w:lastRenderedPageBreak/>
         <w:t xml:space="preserve">De novo </w:t>
       </w:r>
       <w:r>
@@ -2459,6 +2691,7 @@
         <w:rPr>
           <w:rFonts w:eastAsiaTheme="minorEastAsia"/>
         </w:rPr>
+        <w:lastRenderedPageBreak/>
         <w:t>For the hierarchical Dirichlet process–based approach, mSigHdp (v2.1.2) was used. When analyzing all samples, cancer type was used to define the hierarchical structure of the model. For analyses restricted to individual cancer types or to genomes with high tumor mutational burden, de novo signatures were extracted using two</w:t>
       </w:r>
       <w:r>
@@ -2519,7 +2752,6 @@
         <w:rPr>
           <w:rFonts w:eastAsia="宋体"/>
         </w:rPr>
-        <w:lastRenderedPageBreak/>
         <w:t xml:space="preserve">Match </w:t>
       </w:r>
       <w:r>
@@ -2561,7 +2793,14 @@
         <w:rPr>
           <w:rFonts w:eastAsiaTheme="minorEastAsia" w:hint="eastAsia"/>
         </w:rPr>
-        <w:t>). For 89-type signatures, the signatures supported by both mSigHdp and SigProfilerExtractor were matched to the signatures reported in Koh et al. A detailed comparison can be found at Table 1.</w:t>
+        <w:t xml:space="preserve">). For 89-type signatures, the </w:t>
+      </w:r>
+      <w:r>
+        <w:rPr>
+          <w:rFonts w:eastAsiaTheme="minorEastAsia" w:hint="eastAsia"/>
+        </w:rPr>
+        <w:lastRenderedPageBreak/>
+        <w:t>signatures supported by both mSigHdp and SigProfilerExtractor were matched to the signatures reported in Koh et al. A detailed comparison can be found at Table 1.</w:t>
       </w:r>
     </w:p>
     <w:p>
@@ -2695,7 +2934,7 @@
         </w:rPr>
         <w:t>T</w:t>
       </w:r>
-      <w:commentRangeStart w:id="25"/>
+      <w:commentRangeStart w:id="27"/>
       <w:r>
         <w:rPr>
           <w:rFonts w:eastAsia="宋体"/>
@@ -2757,10 +2996,9 @@
         <w:rPr>
           <w:rFonts w:eastAsia="宋体"/>
         </w:rPr>
-        <w:lastRenderedPageBreak/>
         <w:t>Final signature assignments were obtained by integrating results from SigProfilerAssignment for low-TMB tumors and mSigAct for high-TMB tumors</w:t>
       </w:r>
-      <w:commentRangeEnd w:id="25"/>
+      <w:commentRangeEnd w:id="27"/>
       <w:r>
         <w:rPr>
           <w:rStyle w:val="CommentReference"/>
@@ -2768,7 +3006,7 @@
           <w:sz w:val="24"/>
           <w:szCs w:val="24"/>
         </w:rPr>
-        <w:commentReference w:id="25"/>
+        <w:commentReference w:id="27"/>
       </w:r>
       <w:r>
         <w:rPr>
@@ -2782,12 +3020,13 @@
         <w:pStyle w:val="normalfirst"/>
         <w:ind w:firstLineChars="200" w:firstLine="480"/>
       </w:pPr>
-      <w:commentRangeStart w:id="26"/>
+      <w:commentRangeStart w:id="28"/>
       <w:r>
         <w:rPr>
           <w:rFonts w:eastAsia="宋体" w:hint="eastAsia"/>
           <w:shd w:val="clear" w:color="auto" w:fill="FFFF00"/>
         </w:rPr>
+        <w:lastRenderedPageBreak/>
         <w:t xml:space="preserve">&lt;MO CHECK THIS PARA&gt; </w:t>
       </w:r>
       <w:r>
@@ -2805,14 +3044,14 @@
         <w:noBreakHyphen/>
         <w:t>step computational framework. First, we applied the find_best_reconstruction_QP function from the SigTools R package (v1.0.7), which performs fast signature attribution via quadratic programming optimization. Second, we refined these initial estimates using the PresenceAttributeSigActivity function from the mSigAct R package (v1.0.1) with default parameters.</w:t>
       </w:r>
-      <w:commentRangeEnd w:id="26"/>
+      <w:commentRangeEnd w:id="28"/>
       <w:r>
         <w:rPr>
           <w:rStyle w:val="CommentReference"/>
           <w:sz w:val="24"/>
           <w:szCs w:val="24"/>
         </w:rPr>
-        <w:commentReference w:id="26"/>
+        <w:commentReference w:id="28"/>
       </w:r>
     </w:p>
     <w:p>
@@ -2820,7 +3059,7 @@
         <w:pStyle w:val="normalfirst"/>
         <w:ind w:firstLineChars="200" w:firstLine="480"/>
       </w:pPr>
-      <w:commentRangeStart w:id="27"/>
+      <w:commentRangeStart w:id="29"/>
       <w:r>
         <w:t>The 83-type indel spectra are frequently dominated by 1</w:t>
       </w:r>
@@ -2914,14 +3153,14 @@
         <w:noBreakHyphen/>
         <w:t>T components of this corrected residual were retained and allocated to C_ID1 and C_ID2 in proportion to their relative signature weights.</w:t>
       </w:r>
-      <w:commentRangeEnd w:id="27"/>
+      <w:commentRangeEnd w:id="29"/>
       <w:r>
         <w:rPr>
           <w:rStyle w:val="CommentReference"/>
           <w:sz w:val="24"/>
           <w:szCs w:val="24"/>
         </w:rPr>
-        <w:commentReference w:id="27"/>
+        <w:commentReference w:id="29"/>
       </w:r>
     </w:p>
     <w:p>
@@ -2946,7 +3185,6 @@
         <w:rPr>
           <w:rFonts w:eastAsia="宋体"/>
         </w:rPr>
-        <w:lastRenderedPageBreak/>
         <w:t>Simulating synthetic cancer datasets</w:t>
       </w:r>
     </w:p>
@@ -2995,6 +3233,7 @@
         <w:rPr>
           <w:rFonts w:eastAsia="宋体"/>
         </w:rPr>
+        <w:lastRenderedPageBreak/>
         <w:t>Annotating somatic indels based on transcribed versus un-transcribed strand</w:t>
       </w:r>
     </w:p>
@@ -3041,11 +3280,87 @@
         </w:r>
       </w:hyperlink>
       <w:r>
-        <w:t xml:space="preserve">). Valleys and peaks were sorted by the genomic coordinate in ascending order. In regard to + strand of the reference genome, replication timing signals were examined for consecutive stretches of the genome (from valley to peak or form peak to valley), with positive slope corresponded to leading strand regions and negative slope corresponded to lagging strand regions. Then for the - strand of the reference genome, leading regions (- slope) and lagging regions (+slope) were automatically acquired. Similar to the annotation for transcription, indels were first annotated as + or – strand mutations based on the pyrimidine bases. Next, indels were </w:t>
-      </w:r>
-      <w:r>
+        <w:t>). Valleys and peaks were sorted by the genomic coordinate in ascending order. In regard to + strand of the reference genome, replication timing signals were examined for consecutive stretches of the genome (from valley to peak or form peak to valley), with positive slope corresponded to leading strand regions and negative slope corresponded to lagging strand regions. Then for the - strand of the reference genome, leading regions (- slope) and lagging regions (+slope) were automatically acquired. Similar to the annotation for transcription, indels were first annotated as + or – strand mutations based on the pyrimidine bases. Next, indels were counted as being on leading strand or lagging strand based on their occupancy in a leading or lagging region.</w:t>
+      </w:r>
+    </w:p>
+    <w:p>
+      <w:pPr>
+        <w:pStyle w:val="Heading2"/>
+        <w:rPr>
+          <w:rFonts w:eastAsia="宋体"/>
+        </w:rPr>
+      </w:pPr>
+      <w:r>
+        <w:rPr>
+          <w:rFonts w:eastAsia="宋体"/>
+        </w:rPr>
         <w:lastRenderedPageBreak/>
-        <w:t>counted as being on leading strand or lagging strand based on their occupancy in a leading or lagging region.</w:t>
+        <w:t>Detecting strand asymmetries across cancer types</w:t>
+      </w:r>
+    </w:p>
+    <w:p>
+      <w:r>
+        <w:t xml:space="preserve">Strand asymmetry analyses were based on the assignment of signature probabilities to each individual indel mutation. Only indels with the probability greater than or equal to 0.50 to a certain </w:t>
+      </w:r>
+      <w:r>
+        <w:rPr>
+          <w:rFonts w:hint="eastAsia"/>
+        </w:rPr>
+        <w:t>indel</w:t>
+      </w:r>
+      <w:r>
+        <w:t xml:space="preserve"> signature were retained. For each </w:t>
+      </w:r>
+      <w:r>
+        <w:rPr>
+          <w:rFonts w:hint="eastAsia"/>
+        </w:rPr>
+        <w:t>indel</w:t>
+      </w:r>
+      <w:r>
+        <w:t xml:space="preserve"> signature and for all cancer types having this mutational signature, we retrieved the number of indels on each strand/region. In strand asymmetries analyses, only cancer types with at least 1,000 somatic mutations unambiguously attributed to an individual mutational signature were included.</w:t>
+      </w:r>
+    </w:p>
+    <w:p>
+      <w:r>
+        <w:t>For each strand asymmetry analyses (genic and intergenic region asymmetry</w:t>
+      </w:r>
+      <w:r>
+        <w:rPr>
+          <w:rFonts w:hint="eastAsia"/>
+        </w:rPr>
+        <w:t>,</w:t>
+      </w:r>
+      <w:r>
+        <w:t xml:space="preserve"> transcription strand asymmetry, replication strand asymmetry)</w:t>
+      </w:r>
+      <w:r>
+        <w:rPr>
+          <w:rFonts w:hint="eastAsia"/>
+        </w:rPr>
+        <w:t>,</w:t>
+      </w:r>
+      <w:r>
+        <w:t xml:space="preserve"> indel mutations were split into two types and counted (genic vs intergenic mutation, leading strand vs lagging strand mutation, un-transcribed strand vs transcribed strand mutation). The two types were denoted as +/- strand mutations strand mutations in all three cases. The ratio of real somatic indels and the ratio of simulated somatic indels was calculated separately:</w:t>
+      </w:r>
+    </w:p>
+    <w:p>
+      <w:pPr>
+        <w:rPr>
+          <w:i/>
+        </w:rPr>
+      </w:pPr>
+    </w:p>
+    <w:p/>
+    <w:p>
+      <w:r>
+        <w:t>Odds ratio between the ratio of real somatic indels and the ratio of simulated somatic indels was calculated:</w:t>
+      </w:r>
+    </w:p>
+    <w:p/>
+    <w:p>
+      <w:r>
+        <w:t>p values were calculated for the odds ratio using Fisher’s exact test. Only strand asymmetries with p value &gt; 0.05 were considered showing strand asymmetries.</w:t>
       </w:r>
     </w:p>
     <w:p>
@@ -3059,86 +3374,7 @@
         <w:rPr>
           <w:rFonts w:eastAsia="宋体"/>
         </w:rPr>
-        <w:t>Detecting strand asymmetries across cancer types</w:t>
-      </w:r>
-    </w:p>
-    <w:p>
-      <w:r>
-        <w:t xml:space="preserve">Strand asymmetry analyses were based on the assignment of signature probabilities to each individual indel mutation. Only indels with the probability greater than or equal to 0.50 to a certain </w:t>
-      </w:r>
-      <w:r>
-        <w:rPr>
-          <w:rFonts w:hint="eastAsia"/>
-        </w:rPr>
-        <w:t>indel</w:t>
-      </w:r>
-      <w:r>
-        <w:t xml:space="preserve"> signature were retained. For each </w:t>
-      </w:r>
-      <w:r>
-        <w:rPr>
-          <w:rFonts w:hint="eastAsia"/>
-        </w:rPr>
-        <w:t>indel</w:t>
-      </w:r>
-      <w:r>
-        <w:t xml:space="preserve"> signature and for all cancer types having this mutational signature, we retrieved the number of indels on each strand/region. In strand asymmetries analyses, only cancer types with at least 1,000 somatic mutations unambiguously attributed to an individual mutational signature were included.</w:t>
-      </w:r>
-    </w:p>
-    <w:p>
-      <w:r>
-        <w:t>For each strand asymmetry analyses (genic and intergenic region asymmetry</w:t>
-      </w:r>
-      <w:r>
-        <w:rPr>
-          <w:rFonts w:hint="eastAsia"/>
-        </w:rPr>
-        <w:t>,</w:t>
-      </w:r>
-      <w:r>
-        <w:t xml:space="preserve"> transcription strand asymmetry, replication strand asymmetry)</w:t>
-      </w:r>
-      <w:r>
-        <w:rPr>
-          <w:rFonts w:hint="eastAsia"/>
-        </w:rPr>
-        <w:t>,</w:t>
-      </w:r>
-      <w:r>
-        <w:t xml:space="preserve"> indel mutations were split into two types and counted (genic vs intergenic mutation, leading strand vs lagging strand mutation, un-transcribed strand vs transcribed strand mutation). The two types were denoted as +/- strand mutations strand mutations in all three cases. The ratio of real somatic indels and the ratio of simulated somatic indels was calculated separately:</w:t>
-      </w:r>
-    </w:p>
-    <w:p>
-      <w:pPr>
-        <w:rPr>
-          <w:i/>
-        </w:rPr>
-      </w:pPr>
-    </w:p>
-    <w:p/>
-    <w:p>
-      <w:r>
-        <w:t>Odds ratio between the ratio of real somatic indels and the ratio of simulated somatic indels was calculated:</w:t>
-      </w:r>
-    </w:p>
-    <w:p/>
-    <w:p>
-      <w:r>
         <w:lastRenderedPageBreak/>
-        <w:t>p values were calculated for the odds ratio using Fisher’s exact test. Only strand asymmetries with p value &gt; 0.05 were considered showing strand asymmetries.</w:t>
-      </w:r>
-    </w:p>
-    <w:p>
-      <w:pPr>
-        <w:pStyle w:val="Heading2"/>
-        <w:rPr>
-          <w:rFonts w:eastAsia="宋体"/>
-        </w:rPr>
-      </w:pPr>
-      <w:r>
-        <w:rPr>
-          <w:rFonts w:eastAsia="宋体"/>
-        </w:rPr>
         <w:t>Analyses of replication timing across cancer types</w:t>
       </w:r>
     </w:p>
@@ -3283,20 +3519,17 @@
         <w:t>indel</w:t>
       </w:r>
       <w:r>
-        <w:t xml:space="preserve"> signature was considered to be generally unaffected by replication timing if the slope m was not statistically significant from a flat line. Otherwise, with the slope m statistically significant from a flat line, an ID signature was considered to be increasing from </w:t>
-      </w:r>
+        <w:t xml:space="preserve"> signature was considered to be generally unaffected by replication timing if the slope m was not statistically significant from a flat line. Otherwise, with the slope m statistically significant from a flat line, an ID signature was considered to be increasing from early to late replicating regions if the slope m &gt; 0, and was considered to be decreasing from early to late replicating regions if the slope m &lt; 0. </w:t>
+      </w:r>
+    </w:p>
+    <w:p>
+      <w:pPr>
+        <w:rPr>
+          <w:rFonts w:eastAsia="宋体"/>
+        </w:rPr>
+      </w:pPr>
       <w:r>
         <w:lastRenderedPageBreak/>
-        <w:t xml:space="preserve">early to late replicating regions if the slope m &gt; 0, and was considered to be decreasing from early to late replicating regions if the slope m &lt; 0. </w:t>
-      </w:r>
-    </w:p>
-    <w:p>
-      <w:pPr>
-        <w:rPr>
-          <w:rFonts w:eastAsia="宋体"/>
-        </w:rPr>
-      </w:pPr>
-      <w:r>
         <w:t xml:space="preserve">If the trends of a certain </w:t>
       </w:r>
       <w:r>
@@ -3494,7 +3727,15 @@
           <w:rFonts w:hint="eastAsia"/>
           <w:color w:val="000000"/>
         </w:rPr>
-        <w:t>The genomes with &gt;14,000 IDs and &gt;15,000 SBSs were labelled as high TMB tumors. The thresholds were selected based on the minimum number of mutations of the pre-defined MSI tumors. We then used MSI-seq to predict the MSI status of high TMB tumors.</w:t>
+        <w:t xml:space="preserve">The genomes with &gt;14,000 IDs and &gt;15,000 SBSs were labelled as high </w:t>
+      </w:r>
+      <w:r>
+        <w:rPr>
+          <w:rFonts w:hint="eastAsia"/>
+          <w:color w:val="000000"/>
+        </w:rPr>
+        <w:lastRenderedPageBreak/>
+        <w:t>TMB tumors. The thresholds were selected based on the minimum number of mutations of the pre-defined MSI tumors. We then used MSI-seq to predict the MSI status of high TMB tumors.</w:t>
       </w:r>
     </w:p>
     <w:p>
@@ -3723,19 +3964,31 @@
         <w:rPr>
           <w:rFonts w:hint="eastAsia"/>
         </w:rPr>
+        <w:t>Author contributions</w:t>
+      </w:r>
+    </w:p>
+    <w:p>
+      <w:pPr>
+        <w:pStyle w:val="normalfirst"/>
+      </w:pPr>
+      <w:r>
+        <w:rPr>
+          <w:rFonts w:hint="eastAsia"/>
+        </w:rPr>
+        <w:t xml:space="preserve">M.L. and S.G.R. conceived the project and designed the analyses. M.L. and S.G.R. designed computational analysis. M.L., Q.Z. and Y.Y. performed mutational signature extraction, </w:t>
+      </w:r>
+      <w:r>
+        <w:rPr>
+          <w:rFonts w:hint="eastAsia"/>
+        </w:rPr>
         <w:lastRenderedPageBreak/>
-        <w:t>Author contributions</w:t>
-      </w:r>
-    </w:p>
-    <w:p>
-      <w:pPr>
-        <w:pStyle w:val="normalfirst"/>
-      </w:pPr>
-      <w:r>
-        <w:rPr>
-          <w:rFonts w:hint="eastAsia"/>
-        </w:rPr>
-        <w:t xml:space="preserve">M.L. and S.G.R. conceived the project and designed the analyses. M.L. and S.G.R. designed computational analysis. M.L., Q.Z. and Y.Y. performed mutational signature extraction, attribution and characterization computational analysis. M.H. and R.Y. characterized the topography of 83-type mutational signatures. R.S. performed the AUROC analysis. </w:t>
+        <w:t xml:space="preserve">attribution and characterization computational analysis. M.H. and R.Y. characterized the topography of 83-type mutational signatures. R.S. performed the AUROC analysis. </w:t>
+      </w:r>
+      <w:r>
+        <w:rPr>
+          <w:rFonts w:eastAsia="宋体" w:hint="eastAsia"/>
+        </w:rPr>
+        <w:t xml:space="preserve">M.L., X.M.W. and S.G.R. designed the website. </w:t>
       </w:r>
       <w:r>
         <w:t>Data interpretation and manuscript write-up were carried out by M.L., M.H., and S.G.R., with contributions from all other authors. All authors reviewed and approved the final manuscript.</w:t>
@@ -3753,7 +4006,7 @@
       <w:pPr>
         <w:pStyle w:val="Bibliography1"/>
       </w:pPr>
-      <w:bookmarkStart w:id="28" w:name="ZOTERO_BREF_LiVs887hgA47"/>
+      <w:bookmarkStart w:id="30" w:name="ZOTERO_BREF_LiVs887hgA47"/>
       <w:r>
         <w:t xml:space="preserve">Alexandrov, Ludmil B., Young Seok Ju, Kerstin Haase, et al. 2016. ‘Mutational Signatures Associated with Tobacco Smoking in Human Cancer’. </w:t>
       </w:r>
@@ -3823,17 +4076,34 @@
         <w:pStyle w:val="Bibliography1"/>
       </w:pPr>
       <w:r>
+        <w:t xml:space="preserve">Boot, Arnoud, Mo Liu, Nicole Stantial, et al. 2022. ‘Recurrent Mutations in Topoisomerase IIα Cause a Previously Undescribed Mutator Phenotype in Human Cancers’. </w:t>
+      </w:r>
+      <w:r>
+        <w:rPr>
+          <w:i/>
+        </w:rPr>
+        <w:t>Proceedings of the National Academy of Sciences</w:t>
+      </w:r>
+      <w:r>
+        <w:t xml:space="preserve"> 119 (4): e2114024119. https://doi.org/10.1073/pnas.2114024119.</w:t>
+      </w:r>
+    </w:p>
+    <w:p>
+      <w:pPr>
+        <w:pStyle w:val="Bibliography1"/>
+      </w:pPr>
+      <w:r>
         <w:lastRenderedPageBreak/>
-        <w:t xml:space="preserve">Boot, Arnoud, Mo Liu, Nicole Stantial, et al. 2022. ‘Recurrent Mutations in Topoisomerase IIα Cause a Previously Undescribed Mutator Phenotype in Human Cancers’. </w:t>
+        <w:t xml:space="preserve">Boot, Arnoud, Alvin W. T. Ng, Fui Teen Chong, et al. 2020. ‘Characterization of Colibactin-Associated Mutational Signature in an Asian Oral Squamous Cell Carcinoma and in Other Mucosal Tumor Types’. </w:t>
       </w:r>
       <w:r>
         <w:rPr>
           <w:i/>
         </w:rPr>
-        <w:t>Proceedings of the National Academy of Sciences</w:t>
-      </w:r>
-      <w:r>
-        <w:t xml:space="preserve"> 119 (4): e2114024119. https://doi.org/10.1073/pnas.2114024119.</w:t>
+        <w:t>Genome Research</w:t>
+      </w:r>
+      <w:r>
+        <w:t xml:space="preserve"> 30 (6): 803–13. https://doi.org/10.1101/gr.255620.119.</w:t>
       </w:r>
     </w:p>
     <w:p>
@@ -3841,16 +4111,102 @@
         <w:pStyle w:val="Bibliography1"/>
       </w:pPr>
       <w:r>
-        <w:t xml:space="preserve">Boot, Arnoud, Alvin W. T. Ng, Fui Teen Chong, et al. 2020. ‘Characterization of Colibactin-Associated Mutational Signature in an Asian Oral Squamous Cell Carcinoma and in Other Mucosal Tumor Types’. </w:t>
+        <w:t xml:space="preserve">Caipa Garcia, Angela L., Jill E. Kucab, Halh Al-Serori, et al. 2024. ‘Tissue Organoid Cultures Metabolize Dietary Carcinogens Proficiently and Are Effective Models for DNA Adduct Formation’. </w:t>
       </w:r>
       <w:r>
         <w:rPr>
           <w:i/>
         </w:rPr>
+        <w:t>Chemical Research in Toxicology</w:t>
+      </w:r>
+      <w:r>
+        <w:t xml:space="preserve"> 37 (2): 234–47. https://doi.org/10.1021/acs.chemrestox.3c00255.</w:t>
+      </w:r>
+    </w:p>
+    <w:p>
+      <w:pPr>
+        <w:pStyle w:val="Bibliography1"/>
+      </w:pPr>
+      <w:r>
+        <w:t xml:space="preserve">Chen, Lei, Chong Zhang, Ruidong Xue, et al. 2024. ‘Deep Whole-Genome Analysis of 494 Hepatocellular Carcinomas’. </w:t>
+      </w:r>
+      <w:r>
+        <w:rPr>
+          <w:i/>
+        </w:rPr>
+        <w:t>Nature</w:t>
+      </w:r>
+      <w:r>
+        <w:t>, ahead of print, March 21. https://doi.org/10.1038/s41586-024-07054-3.</w:t>
+      </w:r>
+    </w:p>
+    <w:p>
+      <w:pPr>
+        <w:pStyle w:val="Bibliography1"/>
+      </w:pPr>
+      <w:r>
+        <w:t xml:space="preserve">Degasperi, Andrea, Xueqing Zou, Tauanne Dias Amarante, et al. 2022. ‘Substitution Mutational Signatures in Whole-Genome–Sequenced Cancers in the UK Population’. </w:t>
+      </w:r>
+      <w:r>
+        <w:rPr>
+          <w:i/>
+        </w:rPr>
+        <w:t>Science</w:t>
+      </w:r>
+      <w:r>
+        <w:t xml:space="preserve"> 376 (6591). https://doi.org/10.1126/science.abl9283.</w:t>
+      </w:r>
+    </w:p>
+    <w:p>
+      <w:pPr>
+        <w:pStyle w:val="Bibliography1"/>
+      </w:pPr>
+      <w:r>
+        <w:t xml:space="preserve">Dziubańska-Kusibab, Paulina J., Hilmar Berger, Federica Battistini, et al. 2020. ‘Colibactin DNA-Damage Signature Indicates Mutational Impact in Colorectal Cancer’. </w:t>
+      </w:r>
+      <w:r>
+        <w:rPr>
+          <w:i/>
+        </w:rPr>
+        <w:t>Nature Medicine</w:t>
+      </w:r>
+      <w:r>
+        <w:t xml:space="preserve"> 26 (7): 1063–69. https://doi.org/10.1038/s41591-020-0908-2.</w:t>
+      </w:r>
+    </w:p>
+    <w:p>
+      <w:pPr>
+        <w:pStyle w:val="Bibliography1"/>
+      </w:pPr>
+      <w:r>
+        <w:t xml:space="preserve">Hoang, Margaret L., Chung-Hsin Chen, Viktoriya S. Sidorenko, et al. 2013. ‘Mutational Signature of Aristolochic Acid Exposure as Revealed by Whole-Exome Sequencing’. </w:t>
+      </w:r>
+      <w:r>
+        <w:rPr>
+          <w:i/>
+        </w:rPr>
+        <w:t>Science Translational Medicine</w:t>
+      </w:r>
+      <w:r>
+        <w:t xml:space="preserve"> 5 (197). https://doi.org/10.1126/scitranslmed.3006200.</w:t>
+      </w:r>
+    </w:p>
+    <w:p>
+      <w:pPr>
+        <w:pStyle w:val="Bibliography1"/>
+      </w:pPr>
+      <w:r>
+        <w:lastRenderedPageBreak/>
+        <w:t xml:space="preserve">Huang, Mi Ni, Willie Yu, Wei Wei Teoh, et al. 2017. ‘Genome-Scale Mutational Signatures of Aflatoxin in Cells, Mice, and Human Tumors’. </w:t>
+      </w:r>
+      <w:r>
+        <w:rPr>
+          <w:i/>
+        </w:rPr>
         <w:t>Genome Research</w:t>
       </w:r>
       <w:r>
-        <w:t xml:space="preserve"> 30 (6): 803–13. https://doi.org/10.1101/gr.255620.119.</w:t>
+        <w:t xml:space="preserve"> 27 (9): 1475–86. https://doi.org/10.1101/gr.220038.116.</w:t>
       </w:r>
     </w:p>
     <w:p>
@@ -3858,16 +4214,16 @@
         <w:pStyle w:val="Bibliography1"/>
       </w:pPr>
       <w:r>
-        <w:t xml:space="preserve">Caipa Garcia, Angela L., Jill E. Kucab, Halh Al-Serori, et al. 2024. ‘Tissue Organoid Cultures Metabolize Dietary Carcinogens Proficiently and Are Effective Models for DNA Adduct Formation’. </w:t>
+        <w:t xml:space="preserve">Huang, Mini, John R. McPherson, Ioana Cutcutache, Bin Tean Teh, Patrick Tan, and Steven G. Rozen. 2015. ‘MSIseq: Software for Assessing Microsatellite Instability from Catalogs of Somatic Mutations’. </w:t>
       </w:r>
       <w:r>
         <w:rPr>
           <w:i/>
         </w:rPr>
-        <w:t>Chemical Research in Toxicology</w:t>
-      </w:r>
-      <w:r>
-        <w:t xml:space="preserve"> 37 (2): 234–47. https://doi.org/10.1021/acs.chemrestox.3c00255.</w:t>
+        <w:t>Scientific Reports</w:t>
+      </w:r>
+      <w:r>
+        <w:t xml:space="preserve"> 5 (1): 13321. https://doi.org/10.1038/srep13321.</w:t>
       </w:r>
     </w:p>
     <w:p>
@@ -3875,16 +4231,187 @@
         <w:pStyle w:val="Bibliography1"/>
       </w:pPr>
       <w:r>
-        <w:t xml:space="preserve">Chen, Lei, Chong Zhang, Ruidong Xue, et al. 2024. ‘Deep Whole-Genome Analysis of 494 Hepatocellular Carcinomas’. </w:t>
+        <w:t xml:space="preserve">Islam, S. M. Ashiqul, Marcos Díaz-Gay, Yang Wu, et al. 2022. ‘Uncovering Novel Mutational Signatures by de Novo Extraction with SigProfilerExtractor’. </w:t>
       </w:r>
       <w:r>
         <w:rPr>
           <w:i/>
         </w:rPr>
+        <w:t>Cell Genomics</w:t>
+      </w:r>
+      <w:r>
+        <w:t xml:space="preserve"> 2 (11). https://doi.org/10.1016/j.xgen.2022.100179.</w:t>
+      </w:r>
+    </w:p>
+    <w:p>
+      <w:pPr>
+        <w:pStyle w:val="Bibliography1"/>
+      </w:pPr>
+      <w:r>
+        <w:t xml:space="preserve">Jin, Hu, Doga C. Gulhan, Benedikt Geiger, et al. 2024. ‘Accurate and Sensitive Mutational Signature Analysis with MuSiCal’. </w:t>
+      </w:r>
+      <w:r>
+        <w:rPr>
+          <w:i/>
+        </w:rPr>
+        <w:t>Nature Genetics</w:t>
+      </w:r>
+      <w:r>
+        <w:t xml:space="preserve"> 56 (3): 541–52. https://doi.org/10.1038/s41588-024-01659-0.</w:t>
+      </w:r>
+    </w:p>
+    <w:p>
+      <w:pPr>
+        <w:pStyle w:val="Bibliography1"/>
+      </w:pPr>
+      <w:r>
+        <w:t xml:space="preserve">Koh, Gene Ching Chiek, Arjun Scott Nanda, Giuseppe Rinaldi, et al. 2025a. ‘A Redefined InDel Taxonomy Provides Insights into Mutational Signatures’. </w:t>
+      </w:r>
+      <w:r>
+        <w:rPr>
+          <w:i/>
+        </w:rPr>
+        <w:t>Nature Genetics</w:t>
+      </w:r>
+      <w:r>
+        <w:t>, ahead of print, April 10. https://doi.org/10.1038/s41588-025-02152-y.</w:t>
+      </w:r>
+    </w:p>
+    <w:p>
+      <w:pPr>
+        <w:pStyle w:val="Bibliography1"/>
+      </w:pPr>
+      <w:r>
+        <w:t xml:space="preserve">Koh, Gene Ching Chiek, Arjun Scott Nanda, Giuseppe Rinaldi, et al. 2025b. ‘A Redefined InDel Taxonomy Provides Insights into Mutational Signatures’. </w:t>
+      </w:r>
+      <w:r>
+        <w:rPr>
+          <w:i/>
+        </w:rPr>
+        <w:t>Nature Genetics</w:t>
+      </w:r>
+      <w:r>
+        <w:t>, ahead of print, April 10. https://doi.org/10.1038/s41588-025-02152-y.</w:t>
+      </w:r>
+    </w:p>
+    <w:p>
+      <w:pPr>
+        <w:pStyle w:val="Bibliography1"/>
+      </w:pPr>
+      <w:r>
+        <w:t xml:space="preserve">Kucab, Jill E., Xueqing Zou, Sandro Morganella, et al. 2019. ‘A Compendium of Mutational Signatures of Environmental Agents’. </w:t>
+      </w:r>
+      <w:r>
+        <w:rPr>
+          <w:i/>
+        </w:rPr>
+        <w:t>Cell</w:t>
+      </w:r>
+      <w:r>
+        <w:t xml:space="preserve"> 177 (4): 821-836.e16. https://doi.org/10.1016/j.cell.2019.03.001.</w:t>
+      </w:r>
+    </w:p>
+    <w:p>
+      <w:pPr>
+        <w:pStyle w:val="Bibliography1"/>
+      </w:pPr>
+      <w:r>
+        <w:lastRenderedPageBreak/>
+        <w:t xml:space="preserve">Liu, Mo, Yang Wu, Nanhai Jiang, Arnoud Boot, and Steven G. Rozen. 2023. ‘mSigHdp: Hierarchical Dirichlet Process Mixture Modeling for Mutational Signature Discovery’. </w:t>
+      </w:r>
+      <w:r>
+        <w:rPr>
+          <w:i/>
+        </w:rPr>
+        <w:t>NAR Genomics and Bioinformatics</w:t>
+      </w:r>
+      <w:r>
+        <w:t xml:space="preserve"> 5 (1): lqad005. https://doi.org/10.1093/nargab/lqad005.</w:t>
+      </w:r>
+    </w:p>
+    <w:p>
+      <w:pPr>
+        <w:pStyle w:val="Bibliography1"/>
+      </w:pPr>
+      <w:r>
+        <w:t xml:space="preserve">Ng, Alvin W. T., Song Ling Poon, Mi Ni Huang, et al. 2017. </w:t>
+      </w:r>
+      <w:r>
+        <w:rPr>
+          <w:i/>
+        </w:rPr>
+        <w:t>Aristolochic Acids and Their Derivatives Are Widely Implicated in Liver Cancers in Taiwan and throughout Asia</w:t>
+      </w:r>
+      <w:r>
+        <w:t>. https://www.science.org.</w:t>
+      </w:r>
+    </w:p>
+    <w:p>
+      <w:pPr>
+        <w:pStyle w:val="Bibliography1"/>
+      </w:pPr>
+      <w:r>
+        <w:t xml:space="preserve">Nik-Zainal, Serena, Ludmil B. Alexandrov, David C. Wedge, et al. 2012. ‘Mutational Processes Molding the Genomes of 21 Breast Cancers’. </w:t>
+      </w:r>
+      <w:r>
+        <w:rPr>
+          <w:i/>
+        </w:rPr>
+        <w:t>Cell</w:t>
+      </w:r>
+      <w:r>
+        <w:t xml:space="preserve"> 149 (5): 979–93. https://doi.org/10.1016/j.cell.2012.04.024.</w:t>
+      </w:r>
+    </w:p>
+    <w:p>
+      <w:pPr>
+        <w:pStyle w:val="Bibliography1"/>
+      </w:pPr>
+      <w:r>
+        <w:t xml:space="preserve">Poon, Song Ling, Mi Ni Huang, Yang Choo, et al. 2015. ‘Mutation Signatures Implicate Aristolochic Acid in Bladder Cancer Development’. </w:t>
+      </w:r>
+      <w:r>
+        <w:rPr>
+          <w:i/>
+        </w:rPr>
+        <w:t>Genome Medicine</w:t>
+      </w:r>
+      <w:r>
+        <w:t xml:space="preserve"> 7 (1): 38. https://doi.org/10.1186/s13073-015-0161-3.</w:t>
+      </w:r>
+    </w:p>
+    <w:p>
+      <w:pPr>
+        <w:pStyle w:val="Bibliography1"/>
+      </w:pPr>
+      <w:r>
+        <w:t xml:space="preserve">Poon, Song Ling, See-Tong Pang, John R. McPherson, et al. 2013. ‘Genome-Wide Mutational Signatures of Aristolochic Acid and Its Application as a Screening Tool’. </w:t>
+      </w:r>
+      <w:r>
+        <w:rPr>
+          <w:i/>
+        </w:rPr>
+        <w:t>Science Translational Medicine</w:t>
+      </w:r>
+      <w:r>
+        <w:t xml:space="preserve"> 5 (197). https://doi.org/10.1126/scitranslmed.3006086.</w:t>
+      </w:r>
+    </w:p>
+    <w:p>
+      <w:pPr>
+        <w:pStyle w:val="Bibliography1"/>
+      </w:pPr>
+      <w:r>
+        <w:t xml:space="preserve">Reijns, Martin A. M., David A. Parry, Thomas C. Williams, et al. 2022. ‘Signatures of TOP1 Transcription-Associated Mutagenesis in Cancer and Germline’. </w:t>
+      </w:r>
+      <w:r>
+        <w:rPr>
+          <w:i/>
+        </w:rPr>
         <w:t>Nature</w:t>
       </w:r>
       <w:r>
-        <w:t>, ahead of print, March 21. https://doi.org/10.1038/s41586-024-07054-3.</w:t>
+        <w:t xml:space="preserve"> 602 (7898): 623–31. https://doi.org/10.1038/s41586-022-04403-y.</w:t>
       </w:r>
     </w:p>
     <w:p>
@@ -3892,293 +4419,18 @@
         <w:pStyle w:val="Bibliography1"/>
       </w:pPr>
       <w:r>
-        <w:t xml:space="preserve">Degasperi, Andrea, Xueqing Zou, Tauanne Dias Amarante, et al. 2022. ‘Substitution Mutational Signatures in Whole-Genome–Sequenced Cancers in the UK Population’. </w:t>
+        <w:t xml:space="preserve">Riva, Laura, Arun R. Pandiri, Yun Rose Li, et al. 2020. ‘The Mutational Signature Profile of Known and Suspected Human Carcinogens in Mice’. </w:t>
       </w:r>
       <w:r>
         <w:rPr>
           <w:i/>
         </w:rPr>
-        <w:t>Science</w:t>
-      </w:r>
-      <w:r>
-        <w:t xml:space="preserve"> 376 (6591). https://doi.org/10.1126/science.abl9283.</w:t>
-      </w:r>
-    </w:p>
-    <w:p>
-      <w:pPr>
-        <w:pStyle w:val="Bibliography1"/>
-      </w:pPr>
-      <w:r>
-        <w:t xml:space="preserve">Dziubańska-Kusibab, Paulina J., Hilmar Berger, Federica Battistini, et al. 2020. ‘Colibactin DNA-Damage Signature Indicates Mutational Impact in Colorectal Cancer’. </w:t>
-      </w:r>
-      <w:r>
-        <w:rPr>
-          <w:i/>
-        </w:rPr>
-        <w:t>Nature Medicine</w:t>
-      </w:r>
-      <w:r>
-        <w:t xml:space="preserve"> 26 (7): 1063–69. https://doi.org/10.1038/s41591-020-0908-2.</w:t>
-      </w:r>
-    </w:p>
-    <w:p>
-      <w:pPr>
-        <w:pStyle w:val="Bibliography1"/>
-      </w:pPr>
-      <w:r>
-        <w:lastRenderedPageBreak/>
-        <w:t xml:space="preserve">Hoang, Margaret L., Chung-Hsin Chen, Viktoriya S. Sidorenko, et al. 2013. ‘Mutational Signature of Aristolochic Acid Exposure as Revealed by Whole-Exome Sequencing’. </w:t>
-      </w:r>
-      <w:r>
-        <w:rPr>
-          <w:i/>
-        </w:rPr>
-        <w:t>Science Translational Medicine</w:t>
-      </w:r>
-      <w:r>
-        <w:t xml:space="preserve"> 5 (197). https://doi.org/10.1126/scitranslmed.3006200.</w:t>
-      </w:r>
-    </w:p>
-    <w:p>
-      <w:pPr>
-        <w:pStyle w:val="Bibliography1"/>
-      </w:pPr>
-      <w:r>
-        <w:t xml:space="preserve">Huang, Mi Ni, Willie Yu, Wei Wei Teoh, et al. 2017. ‘Genome-Scale Mutational Signatures of Aflatoxin in Cells, Mice, and Human Tumors’. </w:t>
-      </w:r>
-      <w:r>
-        <w:rPr>
-          <w:i/>
-        </w:rPr>
-        <w:t>Genome Research</w:t>
-      </w:r>
-      <w:r>
-        <w:t xml:space="preserve"> 27 (9): 1475–86. https://doi.org/10.1101/gr.220038.116.</w:t>
-      </w:r>
-    </w:p>
-    <w:p>
-      <w:pPr>
-        <w:pStyle w:val="Bibliography1"/>
-      </w:pPr>
-      <w:r>
-        <w:t xml:space="preserve">Huang, Mini, John R. McPherson, Ioana Cutcutache, Bin Tean Teh, Patrick Tan, and Steven G. Rozen. 2015. ‘MSIseq: Software for Assessing Microsatellite Instability from Catalogs of Somatic Mutations’. </w:t>
-      </w:r>
-      <w:r>
-        <w:rPr>
-          <w:i/>
-        </w:rPr>
-        <w:t>Scientific Reports</w:t>
-      </w:r>
-      <w:r>
-        <w:t xml:space="preserve"> 5 (1): 13321. https://doi.org/10.1038/srep13321.</w:t>
-      </w:r>
-    </w:p>
-    <w:p>
-      <w:pPr>
-        <w:pStyle w:val="Bibliography1"/>
-      </w:pPr>
-      <w:r>
-        <w:t xml:space="preserve">Islam, S. M. Ashiqul, Marcos Díaz-Gay, Yang Wu, et al. 2022. ‘Uncovering Novel Mutational Signatures by de Novo Extraction with SigProfilerExtractor’. </w:t>
-      </w:r>
-      <w:r>
-        <w:rPr>
-          <w:i/>
-        </w:rPr>
-        <w:t>Cell Genomics</w:t>
-      </w:r>
-      <w:r>
-        <w:t xml:space="preserve"> 2 (11). https://doi.org/10.1016/j.xgen.2022.100179.</w:t>
-      </w:r>
-    </w:p>
-    <w:p>
-      <w:pPr>
-        <w:pStyle w:val="Bibliography1"/>
-      </w:pPr>
-      <w:r>
-        <w:t xml:space="preserve">Jin, Hu, Doga C. Gulhan, Benedikt Geiger, et al. 2024. ‘Accurate and Sensitive Mutational Signature Analysis with MuSiCal’. </w:t>
-      </w:r>
-      <w:r>
-        <w:rPr>
-          <w:i/>
-        </w:rPr>
         <w:t>Nature Genetics</w:t>
       </w:r>
       <w:r>
-        <w:t xml:space="preserve"> 56 (3): 541–52. https://doi.org/10.1038/s41588-024-01659-0.</w:t>
-      </w:r>
-    </w:p>
-    <w:p>
-      <w:pPr>
-        <w:pStyle w:val="Bibliography1"/>
-      </w:pPr>
-      <w:r>
-        <w:t xml:space="preserve">Koh, Gene Ching Chiek, Arjun Scott Nanda, Giuseppe Rinaldi, et al. 2025a. ‘A Redefined InDel Taxonomy Provides Insights into Mutational Signatures’. </w:t>
-      </w:r>
-      <w:r>
-        <w:rPr>
-          <w:i/>
-        </w:rPr>
-        <w:t>Nature Genetics</w:t>
-      </w:r>
-      <w:r>
-        <w:t>, ahead of print, April 10. https://doi.org/10.1038/s41588-025-02152-y.</w:t>
-      </w:r>
-    </w:p>
-    <w:p>
-      <w:pPr>
-        <w:pStyle w:val="Bibliography1"/>
-      </w:pPr>
-      <w:r>
-        <w:t xml:space="preserve">Koh, Gene Ching Chiek, Arjun Scott Nanda, Giuseppe Rinaldi, et al. 2025b. ‘A Redefined InDel Taxonomy Provides Insights into Mutational Signatures’. </w:t>
-      </w:r>
-      <w:r>
-        <w:rPr>
-          <w:i/>
-        </w:rPr>
-        <w:t>Nature Genetics</w:t>
-      </w:r>
-      <w:r>
-        <w:t>, ahead of print, April 10. https://doi.org/10.1038/s41588-025-02152-y.</w:t>
-      </w:r>
-    </w:p>
-    <w:p>
-      <w:pPr>
-        <w:pStyle w:val="Bibliography1"/>
-      </w:pPr>
-      <w:r>
-        <w:lastRenderedPageBreak/>
-        <w:t xml:space="preserve">Kucab, Jill E., Xueqing Zou, Sandro Morganella, et al. 2019. ‘A Compendium of Mutational Signatures of Environmental Agents’. </w:t>
-      </w:r>
-      <w:r>
-        <w:rPr>
-          <w:i/>
-        </w:rPr>
-        <w:t>Cell</w:t>
-      </w:r>
-      <w:r>
-        <w:t xml:space="preserve"> 177 (4): 821-836.e16. https://doi.org/10.1016/j.cell.2019.03.001.</w:t>
-      </w:r>
-    </w:p>
-    <w:p>
-      <w:pPr>
-        <w:pStyle w:val="Bibliography1"/>
-      </w:pPr>
-      <w:r>
-        <w:t xml:space="preserve">Liu, Mo, Yang Wu, Nanhai Jiang, Arnoud Boot, and Steven G. Rozen. 2023. ‘mSigHdp: Hierarchical Dirichlet Process Mixture Modeling for Mutational Signature Discovery’. </w:t>
-      </w:r>
-      <w:r>
-        <w:rPr>
-          <w:i/>
-        </w:rPr>
-        <w:t>NAR Genomics and Bioinformatics</w:t>
-      </w:r>
-      <w:r>
-        <w:t xml:space="preserve"> 5 (1): lqad005. https://doi.org/10.1093/nargab/lqad005.</w:t>
-      </w:r>
-    </w:p>
-    <w:p>
-      <w:pPr>
-        <w:pStyle w:val="Bibliography1"/>
-      </w:pPr>
-      <w:r>
-        <w:t xml:space="preserve">Ng, Alvin W. T., Song Ling Poon, Mi Ni Huang, et al. 2017. </w:t>
-      </w:r>
-      <w:r>
-        <w:rPr>
-          <w:i/>
-        </w:rPr>
-        <w:t>Aristolochic Acids and Their Derivatives Are Widely Implicated in Liver Cancers in Taiwan and throughout Asia</w:t>
-      </w:r>
-      <w:r>
-        <w:t>. https://www.science.org.</w:t>
-      </w:r>
-    </w:p>
-    <w:p>
-      <w:pPr>
-        <w:pStyle w:val="Bibliography1"/>
-      </w:pPr>
-      <w:r>
-        <w:t xml:space="preserve">Nik-Zainal, Serena, Ludmil B. Alexandrov, David C. Wedge, et al. 2012. ‘Mutational Processes Molding the Genomes of 21 Breast Cancers’. </w:t>
-      </w:r>
-      <w:r>
-        <w:rPr>
-          <w:i/>
-        </w:rPr>
-        <w:t>Cell</w:t>
-      </w:r>
-      <w:r>
-        <w:t xml:space="preserve"> 149 (5): 979–93. https://doi.org/10.1016/j.cell.2012.04.024.</w:t>
-      </w:r>
-    </w:p>
-    <w:p>
-      <w:pPr>
-        <w:pStyle w:val="Bibliography1"/>
-      </w:pPr>
-      <w:r>
-        <w:t xml:space="preserve">Poon, Song Ling, Mi Ni Huang, Yang Choo, et al. 2015. ‘Mutation Signatures Implicate Aristolochic Acid in Bladder Cancer Development’. </w:t>
-      </w:r>
-      <w:r>
-        <w:rPr>
-          <w:i/>
-        </w:rPr>
-        <w:t>Genome Medicine</w:t>
-      </w:r>
-      <w:r>
-        <w:t xml:space="preserve"> 7 (1): 38. https://doi.org/10.1186/s13073-015-0161-3.</w:t>
-      </w:r>
-    </w:p>
-    <w:p>
-      <w:pPr>
-        <w:pStyle w:val="Bibliography1"/>
-      </w:pPr>
-      <w:r>
-        <w:t xml:space="preserve">Poon, Song Ling, See-Tong Pang, John R. McPherson, et al. 2013. ‘Genome-Wide Mutational Signatures of Aristolochic Acid and Its Application as a Screening Tool’. </w:t>
-      </w:r>
-      <w:r>
-        <w:rPr>
-          <w:i/>
-        </w:rPr>
-        <w:t>Science Translational Medicine</w:t>
-      </w:r>
-      <w:r>
-        <w:t xml:space="preserve"> 5 (197). https://doi.org/10.1126/scitranslmed.3006086.</w:t>
-      </w:r>
-    </w:p>
-    <w:p>
-      <w:pPr>
-        <w:pStyle w:val="Bibliography1"/>
-      </w:pPr>
-      <w:r>
-        <w:t xml:space="preserve">Reijns, Martin A. M., David A. Parry, Thomas C. Williams, et al. 2022. ‘Signatures of TOP1 Transcription-Associated Mutagenesis in Cancer and Germline’. </w:t>
-      </w:r>
-      <w:r>
-        <w:rPr>
-          <w:i/>
-        </w:rPr>
-        <w:t>Nature</w:t>
-      </w:r>
-      <w:r>
-        <w:t xml:space="preserve"> 602 (7898): 623–31. https://doi.org/10.1038/s41586-022-04403-y.</w:t>
-      </w:r>
-    </w:p>
-    <w:p>
-      <w:pPr>
-        <w:pStyle w:val="Bibliography1"/>
-      </w:pPr>
-      <w:r>
-        <w:lastRenderedPageBreak/>
-        <w:t xml:space="preserve">Riva, Laura, Arun R. Pandiri, Yun Rose Li, et al. 2020. ‘The Mutational Signature Profile of Known and Suspected Human Carcinogens in Mice’. </w:t>
-      </w:r>
-      <w:r>
-        <w:rPr>
-          <w:i/>
-        </w:rPr>
-        <w:t>Nature Genetics</w:t>
-      </w:r>
-      <w:r>
         <w:t xml:space="preserve"> 52 (11): 1189–97. https://doi.org/10.1038/s41588-020-0692-4.</w:t>
       </w:r>
-      <w:bookmarkEnd w:id="28"/>
+      <w:bookmarkEnd w:id="30"/>
     </w:p>
     <w:p/>
     <w:sectPr>
@@ -4213,7 +4465,7 @@
       </w:r>
     </w:p>
   </w:comment>
-  <w:comment w:id="16" w:author="Mo Liu" w:date="2026-04-16T22:21:00Z" w:initials="ML">
+  <w:comment w:id="16" w:author="Mo Liu" w:date="2026-04-16T22:24:00Z" w:initials="ML">
     <w:p>
       <w:pPr>
         <w:pStyle w:val="CommentText"/>
@@ -4226,11 +4478,11 @@
         <w:annotationRef/>
       </w:r>
       <w:r>
-        <w:t>Missing word?</w:t>
+        <w:t>Done</w:t>
       </w:r>
     </w:p>
   </w:comment>
-  <w:comment w:id="19" w:author="Mo Liu" w:date="2026-04-10T19:52:00Z" w:initials="ML">
+  <w:comment w:id="17" w:author="Mo Liu" w:date="2026-04-16T22:21:00Z" w:initials="ML">
     <w:p>
       <w:pPr>
         <w:pStyle w:val="CommentText"/>
@@ -4243,11 +4495,11 @@
         <w:annotationRef/>
       </w:r>
       <w:r>
-        <w:t>Mo will work on this</w:t>
+        <w:t>Missing word?</w:t>
       </w:r>
     </w:p>
   </w:comment>
-  <w:comment w:id="20" w:author="Mo Liu" w:date="2026-04-10T19:53:00Z" w:initials="ML">
+  <w:comment w:id="20" w:author="Mo Liu" w:date="2026-04-10T19:52:00Z" w:initials="ML">
     <w:p>
       <w:pPr>
         <w:pStyle w:val="CommentText"/>
@@ -4260,11 +4512,28 @@
         <w:annotationRef/>
       </w:r>
       <w:r>
+        <w:t>Mo will work on this</w:t>
+      </w:r>
+    </w:p>
+  </w:comment>
+  <w:comment w:id="21" w:author="Mo Liu" w:date="2026-04-10T19:53:00Z" w:initials="ML">
+    <w:p>
+      <w:pPr>
+        <w:pStyle w:val="CommentText"/>
+        <w:ind w:firstLine="0"/>
+      </w:pPr>
+      <w:r>
+        <w:rPr>
+          <w:rStyle w:val="CommentReference"/>
+        </w:rPr>
+        <w:annotationRef/>
+      </w:r>
+      <w:r>
         <w:t>Mo to do a clock-like analysis for all signatures</w:t>
       </w:r>
     </w:p>
   </w:comment>
-  <w:comment w:id="21" w:author="Mo Liu" w:date="2026-03-24T10:49:00Z" w:initials="ML">
+  <w:comment w:id="22" w:author="Mo Liu" w:date="2026-03-24T10:49:00Z" w:initials="ML">
     <w:p>
       <w:pPr>
         <w:overflowPunct w:val="0"/>
@@ -4284,7 +4553,7 @@
       </w:r>
     </w:p>
   </w:comment>
-  <w:comment w:id="22" w:author="Mo Liu" w:date="2026-04-03T21:55:00Z" w:initials="ML">
+  <w:comment w:id="23" w:author="Mo Liu" w:date="2026-04-03T21:55:00Z" w:initials="ML">
     <w:p>
       <w:pPr>
         <w:overflowPunct w:val="0"/>
@@ -4303,7 +4572,7 @@
       </w:r>
     </w:p>
   </w:comment>
-  <w:comment w:id="24" w:author="Mo Liu" w:date="2026-04-16T22:22:00Z" w:initials="ML">
+  <w:comment w:id="25" w:author="Mo Liu" w:date="2026-04-16T22:22:00Z" w:initials="ML">
     <w:p>
       <w:pPr>
         <w:pStyle w:val="CommentText"/>
@@ -4320,7 +4589,24 @@
       </w:r>
     </w:p>
   </w:comment>
-  <w:comment w:id="25" w:author="Mo Liu" w:date="2026-04-07T16:26:00Z" w:initials="ML">
+  <w:comment w:id="26" w:author="Mo Liu" w:date="2026-04-16T23:04:00Z" w:initials="ML">
+    <w:p>
+      <w:pPr>
+        <w:pStyle w:val="CommentText"/>
+        <w:ind w:firstLine="0"/>
+      </w:pPr>
+      <w:r>
+        <w:rPr>
+          <w:rStyle w:val="CommentReference"/>
+        </w:rPr>
+        <w:annotationRef/>
+      </w:r>
+      <w:r>
+        <w:t>New paragraph about gender association</w:t>
+      </w:r>
+    </w:p>
+  </w:comment>
+  <w:comment w:id="27" w:author="Mo Liu" w:date="2026-04-07T16:26:00Z" w:initials="ML">
     <w:p>
       <w:pPr>
         <w:spacing w:after="0" w:line="240" w:lineRule="auto"/>
@@ -4338,7 +4624,7 @@
       </w:r>
     </w:p>
   </w:comment>
-  <w:comment w:id="26" w:author="Mo Liu" w:date="2026-04-07T16:19:00Z" w:initials="ML">
+  <w:comment w:id="28" w:author="Mo Liu" w:date="2026-04-07T16:19:00Z" w:initials="ML">
     <w:p>
       <w:pPr>
         <w:spacing w:after="0" w:line="240" w:lineRule="auto"/>
@@ -4356,7 +4642,7 @@
       </w:r>
     </w:p>
   </w:comment>
-  <w:comment w:id="27" w:author="Mo Liu" w:date="2026-04-07T16:27:00Z" w:initials="ML">
+  <w:comment w:id="29" w:author="Mo Liu" w:date="2026-04-07T16:27:00Z" w:initials="ML">
     <w:p>
       <w:pPr>
         <w:spacing w:after="0" w:line="240" w:lineRule="auto"/>
@@ -4380,12 +4666,14 @@
 <file path=word/commentsExtended.xml><?xml version="1.0" encoding="utf-8"?>
 <w15:commentsEx xmlns:wpc="http://schemas.microsoft.com/office/word/2010/wordprocessingCanvas" xmlns:cx="http://schemas.microsoft.com/office/drawing/2014/chartex" xmlns:cx1="http://schemas.microsoft.com/office/drawing/2015/9/8/chartex" xmlns:cx2="http://schemas.microsoft.com/office/drawing/2015/10/21/chartex" xmlns:cx3="http://schemas.microsoft.com/office/drawing/2016/5/9/chartex" xmlns:cx4="http://schemas.microsoft.com/office/drawing/2016/5/10/chartex" xmlns:cx5="http://schemas.microsoft.com/office/drawing/2016/5/11/chartex" xmlns:cx6="http://schemas.microsoft.com/office/drawing/2016/5/12/chartex" xmlns:cx7="http://schemas.microsoft.com/office/drawing/2016/5/13/chartex" xmlns:cx8="http://schemas.microsoft.com/office/drawing/2016/5/14/chartex" xmlns:mc="http://schemas.openxmlformats.org/markup-compatibility/2006" xmlns:aink="http://schemas.microsoft.com/office/drawing/2016/ink" xmlns:am3d="http://schemas.microsoft.com/office/drawing/2017/model3d" xmlns:o="urn:schemas-microsoft-com:office:office" xmlns:oel="http://schemas.microsoft.com/office/2019/extlst" xmlns:r="http://schemas.openxmlformats.org/officeDocument/2006/relationships" xmlns:m="http://schemas.openxmlformats.org/officeDocument/2006/math" xmlns:v="urn:schemas-microsoft-com:vml" xmlns:wp14="http://schemas.microsoft.com/office/word/2010/wordprocessingDrawing" xmlns:wp="http://schemas.openxmlformats.org/drawingml/2006/wordprocessingDrawing" xmlns:w10="urn:schemas-microsoft-com:office:word" xmlns:w="http://schemas.openxmlformats.org/wordprocessingml/2006/main" xmlns:w14="http://schemas.microsoft.com/office/word/2010/wordml" xmlns:w15="http://schemas.microsoft.com/office/word/2012/wordml" xmlns:w16cex="http://schemas.microsoft.com/office/word/2018/wordml/cex" xmlns:w16cid="http://schemas.microsoft.com/office/word/2016/wordml/cid" xmlns:w16="http://schemas.microsoft.com/office/word/2018/wordml" xmlns:w16du="http://schemas.microsoft.com/office/word/2023/wordml/word16du" xmlns:w16sdtdh="http://schemas.microsoft.com/office/word/2020/wordml/sdtdatahash" xmlns:w16sdtfl="http://schemas.microsoft.com/office/word/2024/wordml/sdtformatlock" xmlns:w16se="http://schemas.microsoft.com/office/word/2015/wordml/symex" xmlns:wpg="http://schemas.microsoft.com/office/word/2010/wordprocessingGroup" xmlns:wpi="http://schemas.microsoft.com/office/word/2010/wordprocessingInk" xmlns:wne="http://schemas.microsoft.com/office/word/2006/wordml" xmlns:wps="http://schemas.microsoft.com/office/word/2010/wordprocessingShape" mc:Ignorable="w14 w15 w16se w16cid w16 w16cex w16sdtdh w16sdtfl w16du wp14">
   <w15:commentEx w15:paraId="55655389" w15:done="0"/>
+  <w15:commentEx w15:paraId="246E53C3" w15:paraIdParent="55655389" w15:done="0"/>
   <w15:commentEx w15:paraId="45CAC5C8" w15:done="0"/>
   <w15:commentEx w15:paraId="3716C50A" w15:done="0"/>
   <w15:commentEx w15:paraId="4DABB6BB" w15:done="0"/>
   <w15:commentEx w15:paraId="307B5635" w15:done="0"/>
   <w15:commentEx w15:paraId="06A707BF" w15:done="0"/>
   <w15:commentEx w15:paraId="58537171" w15:done="0"/>
+  <w15:commentEx w15:paraId="73AE89E6" w15:done="0"/>
   <w15:commentEx w15:paraId="50E0F1B8" w15:done="0"/>
   <w15:commentEx w15:paraId="60A5F6AF" w15:done="0"/>
   <w15:commentEx w15:paraId="59F5856B" w15:done="0"/>
@@ -4395,22 +4683,26 @@
 <file path=word/commentsExtensible.xml><?xml version="1.0" encoding="utf-8"?>
 <w16cex:commentsExtensible xmlns:wpc="http://schemas.microsoft.com/office/word/2010/wordprocessingCanvas" xmlns:cx="http://schemas.microsoft.com/office/drawing/2014/chartex" xmlns:cx1="http://schemas.microsoft.com/office/drawing/2015/9/8/chartex" xmlns:cx2="http://schemas.microsoft.com/office/drawing/2015/10/21/chartex" xmlns:cx3="http://schemas.microsoft.com/office/drawing/2016/5/9/chartex" xmlns:cx4="http://schemas.microsoft.com/office/drawing/2016/5/10/chartex" xmlns:cx5="http://schemas.microsoft.com/office/drawing/2016/5/11/chartex" xmlns:cx6="http://schemas.microsoft.com/office/drawing/2016/5/12/chartex" xmlns:cx7="http://schemas.microsoft.com/office/drawing/2016/5/13/chartex" xmlns:cx8="http://schemas.microsoft.com/office/drawing/2016/5/14/chartex" xmlns:cr="http://schemas.microsoft.com/office/comments/2020/reactions" xmlns:mc="http://schemas.openxmlformats.org/markup-compatibility/2006" xmlns:aink="http://schemas.microsoft.com/office/drawing/2016/ink" xmlns:am3d="http://schemas.microsoft.com/office/drawing/2017/model3d" xmlns:o="urn:schemas-microsoft-com:office:office" xmlns:oel="http://schemas.microsoft.com/office/2019/extlst" xmlns:r="http://schemas.openxmlformats.org/officeDocument/2006/relationships" xmlns:m="http://schemas.openxmlformats.org/officeDocument/2006/math" xmlns:v="urn:schemas-microsoft-com:vml" xmlns:wp14="http://schemas.microsoft.com/office/word/2010/wordprocessingDrawing" xmlns:wp="http://schemas.openxmlformats.org/drawingml/2006/wordprocessingDrawing" xmlns:w10="urn:schemas-microsoft-com:office:word" xmlns:w="http://schemas.openxmlformats.org/wordprocessingml/2006/main" xmlns:w14="http://schemas.microsoft.com/office/word/2010/wordml" xmlns:w15="http://schemas.microsoft.com/office/word/2012/wordml" xmlns:w16cex="http://schemas.microsoft.com/office/word/2018/wordml/cex" xmlns:w16cid="http://schemas.microsoft.com/office/word/2016/wordml/cid" xmlns:w16="http://schemas.microsoft.com/office/word/2018/wordml" xmlns:w16du="http://schemas.microsoft.com/office/word/2023/wordml/word16du" xmlns:w16sdtdh="http://schemas.microsoft.com/office/word/2020/wordml/sdtdatahash" xmlns:w16sdtfl="http://schemas.microsoft.com/office/word/2024/wordml/sdtformatlock" xmlns:w16se="http://schemas.microsoft.com/office/word/2015/wordml/symex" xmlns:wpg="http://schemas.microsoft.com/office/word/2010/wordprocessingGroup" xmlns:wpi="http://schemas.microsoft.com/office/word/2010/wordprocessingInk" xmlns:wne="http://schemas.microsoft.com/office/word/2006/wordml" xmlns:wps="http://schemas.microsoft.com/office/word/2010/wordprocessingShape" mc:Ignorable="w14 w15 w16se w16cid w16 w16cex w16sdtdh w16sdtfl cr w16du wp14">
   <w16cex:commentExtensible w16cex:durableId="4C90883E" w16cex:dateUtc="2026-04-10T08:58:00Z"/>
+  <w16cex:commentExtensible w16cex:durableId="5E3AF964" w16cex:dateUtc="2026-04-16T14:24:00Z"/>
   <w16cex:commentExtensible w16cex:durableId="6B59C060" w16cex:dateUtc="2026-04-16T14:21:00Z"/>
   <w16cex:commentExtensible w16cex:durableId="14A5EA27" w16cex:dateUtc="2026-04-10T11:52:00Z"/>
   <w16cex:commentExtensible w16cex:durableId="2BB33DEB" w16cex:dateUtc="2026-04-10T11:53:00Z"/>
   <w16cex:commentExtensible w16cex:durableId="18C8E9EB" w16cex:dateUtc="2026-04-16T14:22:00Z"/>
+  <w16cex:commentExtensible w16cex:durableId="12F1D1C7" w16cex:dateUtc="2026-04-16T15:04:00Z"/>
 </w16cex:commentsExtensible>
 </file>
 
 <file path=word/commentsIds.xml><?xml version="1.0" encoding="utf-8"?>
 <w16cid:commentsIds xmlns:wpc="http://schemas.microsoft.com/office/word/2010/wordprocessingCanvas" xmlns:cx="http://schemas.microsoft.com/office/drawing/2014/chartex" xmlns:cx1="http://schemas.microsoft.com/office/drawing/2015/9/8/chartex" xmlns:cx2="http://schemas.microsoft.com/office/drawing/2015/10/21/chartex" xmlns:cx3="http://schemas.microsoft.com/office/drawing/2016/5/9/chartex" xmlns:cx4="http://schemas.microsoft.com/office/drawing/2016/5/10/chartex" xmlns:cx5="http://schemas.microsoft.com/office/drawing/2016/5/11/chartex" xmlns:cx6="http://schemas.microsoft.com/office/drawing/2016/5/12/chartex" xmlns:cx7="http://schemas.microsoft.com/office/drawing/2016/5/13/chartex" xmlns:cx8="http://schemas.microsoft.com/office/drawing/2016/5/14/chartex" xmlns:mc="http://schemas.openxmlformats.org/markup-compatibility/2006" xmlns:aink="http://schemas.microsoft.com/office/drawing/2016/ink" xmlns:am3d="http://schemas.microsoft.com/office/drawing/2017/model3d" xmlns:o="urn:schemas-microsoft-com:office:office" xmlns:oel="http://schemas.microsoft.com/office/2019/extlst" xmlns:r="http://schemas.openxmlformats.org/officeDocument/2006/relationships" xmlns:m="http://schemas.openxmlformats.org/officeDocument/2006/math" xmlns:v="urn:schemas-microsoft-com:vml" xmlns:wp14="http://schemas.microsoft.com/office/word/2010/wordprocessingDrawing" xmlns:wp="http://schemas.openxmlformats.org/drawingml/2006/wordprocessingDrawing" xmlns:w10="urn:schemas-microsoft-com:office:word" xmlns:w="http://schemas.openxmlformats.org/wordprocessingml/2006/main" xmlns:w14="http://schemas.microsoft.com/office/word/2010/wordml" xmlns:w15="http://schemas.microsoft.com/office/word/2012/wordml" xmlns:w16cex="http://schemas.microsoft.com/office/word/2018/wordml/cex" xmlns:w16cid="http://schemas.microsoft.com/office/word/2016/wordml/cid" xmlns:w16="http://schemas.microsoft.com/office/word/2018/wordml" xmlns:w16du="http://schemas.microsoft.com/office/word/2023/wordml/word16du" xmlns:w16sdtdh="http://schemas.microsoft.com/office/word/2020/wordml/sdtdatahash" xmlns:w16sdtfl="http://schemas.microsoft.com/office/word/2024/wordml/sdtformatlock" xmlns:w16se="http://schemas.microsoft.com/office/word/2015/wordml/symex" xmlns:wpg="http://schemas.microsoft.com/office/word/2010/wordprocessingGroup" xmlns:wpi="http://schemas.microsoft.com/office/word/2010/wordprocessingInk" xmlns:wne="http://schemas.microsoft.com/office/word/2006/wordml" xmlns:wps="http://schemas.microsoft.com/office/word/2010/wordprocessingShape" mc:Ignorable="w14 w15 w16se w16cid w16 w16cex w16sdtdh w16sdtfl w16du wp14">
   <w16cid:commentId w16cid:paraId="55655389" w16cid:durableId="4C90883E"/>
+  <w16cid:commentId w16cid:paraId="246E53C3" w16cid:durableId="5E3AF964"/>
   <w16cid:commentId w16cid:paraId="45CAC5C8" w16cid:durableId="6B59C060"/>
   <w16cid:commentId w16cid:paraId="3716C50A" w16cid:durableId="14A5EA27"/>
   <w16cid:commentId w16cid:paraId="4DABB6BB" w16cid:durableId="2BB33DEB"/>
   <w16cid:commentId w16cid:paraId="307B5635" w16cid:durableId="0232A0F8"/>
   <w16cid:commentId w16cid:paraId="06A707BF" w16cid:durableId="1269E9C8"/>
   <w16cid:commentId w16cid:paraId="58537171" w16cid:durableId="18C8E9EB"/>
+  <w16cid:commentId w16cid:paraId="73AE89E6" w16cid:durableId="12F1D1C7"/>
   <w16cid:commentId w16cid:paraId="50E0F1B8" w16cid:durableId="11165405"/>
   <w16cid:commentId w16cid:paraId="60A5F6AF" w16cid:durableId="5D9500DB"/>
   <w16cid:commentId w16cid:paraId="59F5856B" w16cid:durableId="16E5042E"/>
@@ -5261,7 +5553,6 @@
   <w:style w:type="character" w:default="1" w:styleId="DefaultParagraphFont">
     <w:name w:val="Default Paragraph Font"/>
     <w:uiPriority w:val="1"/>
-    <w:semiHidden/>
     <w:unhideWhenUsed/>
   </w:style>
   <w:style w:type="table" w:default="1" w:styleId="TableNormal">

</xml_diff>